<commit_message>
Override Draft_125_body with user upload; remove Draft_126
Working body = Draft_125_body only.
</commit_message>
<xml_diff>
--- a/thesis/003_ThesisProposal_Draft_125_body.docx
+++ b/thesis/003_ThesisProposal_Draft_125_body.docx
@@ -16186,11 +16186,22 @@
     </w:p>
     <w:p>
       <w:pPr>
-        <w:keepNext w:val="1"/>
-        <w:keepLines w:val="1"/>
-        <w:spacing w:after="0" w:before="240" w:line="480" w:lineRule="auto"/>
-        <w:ind w:left="0" w:right="0" w:firstLine="0"/>
-        <w:jc w:val="left"/>
+        <w:spacing w:after="0" w:before="0" w:line="480" w:lineRule="auto"/>
+        <w:ind w:left="0" w:firstLine="0"/>
+        <w:jc w:val="both"/>
+        <w:rPr/>
+      </w:pPr>
+      <w:r>
+        <w:rPr>
+          <w:rtl w:val="0"/>
+        </w:rPr>
+      </w:r>
+    </w:p>
+    <w:p>
+      <w:pPr>
+        <w:spacing w:after="0" w:before="0" w:line="360" w:lineRule="auto"/>
+        <w:ind w:left="0" w:firstLine="0"/>
+        <w:jc w:val="both"/>
         <w:rPr/>
       </w:pPr>
       <w:r>
@@ -16215,7 +16226,7 @@
     <w:p>
       <w:pPr>
         <w:keepNext w:val="1"/>
-        <w:spacing w:after="0" w:before="240" w:line="480" w:lineRule="auto"/>
+        <w:spacing w:after="0" w:before="240" w:line="360" w:lineRule="auto"/>
         <w:ind w:left="0" w:firstLine="0"/>
         <w:jc w:val="left"/>
         <w:rPr/>
@@ -16242,7 +16253,7 @@
     <w:p>
       <w:pPr>
         <w:keepNext w:val="1"/>
-        <w:spacing w:after="240" w:before="0" w:line="480" w:lineRule="auto"/>
+        <w:spacing w:after="240" w:before="0" w:line="276" w:lineRule="auto"/>
         <w:ind w:left="0" w:firstLine="0"/>
         <w:jc w:val="left"/>
         <w:rPr/>

</xml_diff>